<commit_message>
add 1 TMC paper
</commit_message>
<xml_diff>
--- a/files/github pages + jekyll 说明.docx
+++ b/files/github pages + jekyll 说明.docx
@@ -2,6 +2,259 @@
 <file path=word/document.xml><?xml version="1.0" encoding="utf-8"?>
 <w:document xmlns:wpc="http://schemas.microsoft.com/office/word/2010/wordprocessingCanvas" xmlns:cx="http://schemas.microsoft.com/office/drawing/2014/chartex" xmlns:cx1="http://schemas.microsoft.com/office/drawing/2015/9/8/chartex" xmlns:cx2="http://schemas.microsoft.com/office/drawing/2015/10/21/chartex" xmlns:cx3="http://schemas.microsoft.com/office/drawing/2016/5/9/chartex" xmlns:cx4="http://schemas.microsoft.com/office/drawing/2016/5/10/chartex" xmlns:cx5="http://schemas.microsoft.com/office/drawing/2016/5/11/chartex" xmlns:cx6="http://schemas.microsoft.com/office/drawing/2016/5/12/chartex" xmlns:cx7="http://schemas.microsoft.com/office/drawing/2016/5/13/chartex" xmlns:cx8="http://schemas.microsoft.com/office/drawing/2016/5/14/chartex" xmlns:mc="http://schemas.openxmlformats.org/markup-compatibility/2006" xmlns:aink="http://schemas.microsoft.com/office/drawing/2016/ink" xmlns:am3d="http://schemas.microsoft.com/office/drawing/2017/model3d" xmlns:o="urn:schemas-microsoft-com:office:office" xmlns:r="http://schemas.openxmlformats.org/officeDocument/2006/relationships" xmlns:m="http://schemas.openxmlformats.org/officeDocument/2006/math" xmlns:v="urn:schemas-microsoft-com:vml" xmlns:wp14="http://schemas.microsoft.com/office/word/2010/wordprocessingDrawing" xmlns:wp="http://schemas.openxmlformats.org/drawingml/2006/wordprocessingDrawing" xmlns:w10="urn:schemas-microsoft-com:office:word" xmlns:w="http://schemas.openxmlformats.org/wordprocessingml/2006/main" xmlns:w14="http://schemas.microsoft.com/office/word/2010/wordml" xmlns:w15="http://schemas.microsoft.com/office/word/2012/wordml" xmlns:w16cex="http://schemas.microsoft.com/office/word/2018/wordml/cex" xmlns:w16cid="http://schemas.microsoft.com/office/word/2016/wordml/cid" xmlns:w16="http://schemas.microsoft.com/office/word/2018/wordml" xmlns:w16sdtdh="http://schemas.microsoft.com/office/word/2020/wordml/sdtdatahash" xmlns:w16se="http://schemas.microsoft.com/office/word/2015/wordml/symex" xmlns:wpg="http://schemas.microsoft.com/office/word/2010/wordprocessingGroup" xmlns:wpi="http://schemas.microsoft.com/office/word/2010/wordprocessingInk" xmlns:wne="http://schemas.microsoft.com/office/word/2006/wordml" xmlns:wps="http://schemas.microsoft.com/office/word/2010/wordprocessingShape" mc:Ignorable="w14 w15 w16se w16cid w16 w16cex w16sdtdh wp14">
   <w:body>
+    <w:p>
+      <w:pPr>
+        <w:widowControl/>
+        <w:shd w:val="clear" w:color="auto" w:fill="FFFFFF"/>
+        <w:jc w:val="left"/>
+        <w:rPr>
+          <w:rFonts w:ascii="Arial" w:eastAsia="宋体" w:hAnsi="Arial" w:cs="Arial"/>
+          <w:color w:val="777777"/>
+          <w:kern w:val="0"/>
+          <w:szCs w:val="21"/>
+        </w:rPr>
+      </w:pPr>
+      <w:r>
+        <w:rPr>
+          <w:rFonts w:ascii="Arial" w:eastAsia="宋体" w:hAnsi="Arial" w:cs="Arial" w:hint="eastAsia"/>
+          <w:color w:val="777777"/>
+          <w:kern w:val="0"/>
+          <w:szCs w:val="21"/>
+        </w:rPr>
+        <w:t>安装后主要命令</w:t>
+      </w:r>
+    </w:p>
+    <w:p>
+      <w:pPr>
+        <w:widowControl/>
+        <w:shd w:val="clear" w:color="auto" w:fill="FFFFFF"/>
+        <w:jc w:val="left"/>
+        <w:rPr>
+          <w:rFonts w:ascii="Arial" w:eastAsia="宋体" w:hAnsi="Arial" w:cs="Arial"/>
+          <w:color w:val="777777"/>
+          <w:kern w:val="0"/>
+          <w:szCs w:val="21"/>
+        </w:rPr>
+      </w:pPr>
+    </w:p>
+    <w:p>
+      <w:pPr>
+        <w:widowControl/>
+        <w:shd w:val="clear" w:color="auto" w:fill="FFFFFF"/>
+        <w:jc w:val="left"/>
+        <w:rPr>
+          <w:rFonts w:ascii="Arial" w:eastAsia="宋体" w:hAnsi="Arial" w:cs="Arial"/>
+          <w:color w:val="777777"/>
+          <w:kern w:val="0"/>
+          <w:szCs w:val="21"/>
+        </w:rPr>
+      </w:pPr>
+      <w:proofErr w:type="gramStart"/>
+      <w:r>
+        <w:rPr>
+          <w:rFonts w:ascii="Arial" w:eastAsia="宋体" w:hAnsi="Arial" w:cs="Arial" w:hint="eastAsia"/>
+          <w:color w:val="777777"/>
+          <w:kern w:val="0"/>
+          <w:szCs w:val="21"/>
+        </w:rPr>
+        <w:t>切换盘</w:t>
+      </w:r>
+      <w:proofErr w:type="gramEnd"/>
+      <w:r>
+        <w:rPr>
+          <w:rFonts w:ascii="Arial" w:eastAsia="宋体" w:hAnsi="Arial" w:cs="Arial" w:hint="eastAsia"/>
+          <w:color w:val="777777"/>
+          <w:kern w:val="0"/>
+          <w:szCs w:val="21"/>
+        </w:rPr>
+        <w:t>目录</w:t>
+      </w:r>
+      <w:r>
+        <w:rPr>
+          <w:rFonts w:ascii="Arial" w:eastAsia="宋体" w:hAnsi="Arial" w:cs="Arial" w:hint="eastAsia"/>
+          <w:color w:val="777777"/>
+          <w:kern w:val="0"/>
+          <w:szCs w:val="21"/>
+        </w:rPr>
+        <w:t xml:space="preserve"> </w:t>
+      </w:r>
+      <w:r>
+        <w:rPr>
+          <w:rFonts w:ascii="Arial" w:eastAsia="宋体" w:hAnsi="Arial" w:cs="Arial"/>
+          <w:color w:val="FF0000"/>
+          <w:kern w:val="0"/>
+          <w:szCs w:val="21"/>
+        </w:rPr>
+        <w:t>cd /</w:t>
+      </w:r>
+      <w:proofErr w:type="spellStart"/>
+      <w:r>
+        <w:rPr>
+          <w:rFonts w:ascii="Arial" w:eastAsia="宋体" w:hAnsi="Arial" w:cs="Arial"/>
+          <w:color w:val="FF0000"/>
+          <w:kern w:val="0"/>
+          <w:szCs w:val="21"/>
+        </w:rPr>
+        <w:t>mnt</w:t>
+      </w:r>
+      <w:proofErr w:type="spellEnd"/>
+      <w:r>
+        <w:rPr>
+          <w:rFonts w:ascii="Arial" w:eastAsia="宋体" w:hAnsi="Arial" w:cs="Arial"/>
+          <w:color w:val="FF0000"/>
+          <w:kern w:val="0"/>
+          <w:szCs w:val="21"/>
+        </w:rPr>
+        <w:t>/e</w:t>
+      </w:r>
+    </w:p>
+    <w:p>
+      <w:pPr>
+        <w:widowControl/>
+        <w:shd w:val="clear" w:color="auto" w:fill="FFFFFF"/>
+        <w:jc w:val="left"/>
+        <w:rPr>
+          <w:rFonts w:ascii="Arial" w:eastAsia="宋体" w:hAnsi="Arial" w:cs="Arial" w:hint="eastAsia"/>
+          <w:color w:val="FF0000"/>
+          <w:kern w:val="0"/>
+          <w:szCs w:val="21"/>
+        </w:rPr>
+      </w:pPr>
+      <w:r>
+        <w:rPr>
+          <w:rFonts w:ascii="Arial" w:eastAsia="宋体" w:hAnsi="Arial" w:cs="Arial" w:hint="eastAsia"/>
+          <w:color w:val="777777"/>
+          <w:kern w:val="0"/>
+          <w:szCs w:val="21"/>
+        </w:rPr>
+        <w:t>运行</w:t>
+      </w:r>
+      <w:proofErr w:type="spellStart"/>
+      <w:r>
+        <w:rPr>
+          <w:rFonts w:ascii="Arial" w:eastAsia="宋体" w:hAnsi="Arial" w:cs="Arial" w:hint="eastAsia"/>
+          <w:color w:val="FF0000"/>
+          <w:kern w:val="0"/>
+          <w:szCs w:val="21"/>
+        </w:rPr>
+        <w:t>jekyll</w:t>
+      </w:r>
+      <w:proofErr w:type="spellEnd"/>
+      <w:r>
+        <w:rPr>
+          <w:rFonts w:ascii="Arial" w:eastAsia="宋体" w:hAnsi="Arial" w:cs="Arial"/>
+          <w:color w:val="FF0000"/>
+          <w:kern w:val="0"/>
+          <w:szCs w:val="21"/>
+        </w:rPr>
+        <w:t xml:space="preserve"> </w:t>
+      </w:r>
+      <w:r>
+        <w:rPr>
+          <w:rFonts w:ascii="Arial" w:eastAsia="宋体" w:hAnsi="Arial" w:cs="Arial" w:hint="eastAsia"/>
+          <w:color w:val="FF0000"/>
+          <w:kern w:val="0"/>
+          <w:szCs w:val="21"/>
+        </w:rPr>
+        <w:t>bundle</w:t>
+      </w:r>
+      <w:r>
+        <w:rPr>
+          <w:rFonts w:ascii="Arial" w:eastAsia="宋体" w:hAnsi="Arial" w:cs="Arial"/>
+          <w:color w:val="FF0000"/>
+          <w:kern w:val="0"/>
+          <w:szCs w:val="21"/>
+        </w:rPr>
+        <w:t xml:space="preserve"> exec Jekyll serve</w:t>
+      </w:r>
+    </w:p>
+    <w:p>
+      <w:pPr>
+        <w:widowControl/>
+        <w:pBdr>
+          <w:bottom w:val="double" w:sz="6" w:space="1" w:color="auto"/>
+        </w:pBdr>
+        <w:shd w:val="clear" w:color="auto" w:fill="FFFFFF"/>
+        <w:jc w:val="left"/>
+        <w:rPr>
+          <w:rFonts w:ascii="Arial" w:eastAsia="宋体" w:hAnsi="Arial" w:cs="Arial"/>
+          <w:color w:val="777777"/>
+          <w:kern w:val="0"/>
+          <w:szCs w:val="21"/>
+        </w:rPr>
+      </w:pPr>
+      <w:r>
+        <w:rPr>
+          <w:rFonts w:ascii="Arial" w:eastAsia="宋体" w:hAnsi="Arial" w:cs="Arial" w:hint="eastAsia"/>
+          <w:color w:val="777777"/>
+          <w:kern w:val="0"/>
+          <w:szCs w:val="21"/>
+        </w:rPr>
+        <w:t>查看网页：</w:t>
+      </w:r>
+      <w:hyperlink r:id="rId6" w:history="1">
+        <w:r>
+          <w:rPr>
+            <w:rStyle w:val="a4"/>
+            <w:rFonts w:ascii="Arial" w:eastAsia="宋体" w:hAnsi="Arial" w:cs="Arial"/>
+            <w:kern w:val="0"/>
+            <w:szCs w:val="21"/>
+          </w:rPr>
+          <w:t>http://localhost:4000/</w:t>
+        </w:r>
+      </w:hyperlink>
+    </w:p>
+    <w:p>
+      <w:pPr>
+        <w:widowControl/>
+        <w:pBdr>
+          <w:bottom w:val="double" w:sz="6" w:space="1" w:color="auto"/>
+        </w:pBdr>
+        <w:shd w:val="clear" w:color="auto" w:fill="FFFFFF"/>
+        <w:jc w:val="left"/>
+        <w:rPr>
+          <w:rFonts w:ascii="Arial" w:eastAsia="宋体" w:hAnsi="Arial" w:cs="Arial" w:hint="eastAsia"/>
+          <w:color w:val="777777"/>
+          <w:kern w:val="0"/>
+          <w:szCs w:val="21"/>
+        </w:rPr>
+      </w:pPr>
+    </w:p>
+    <w:p>
+      <w:pPr>
+        <w:widowControl/>
+        <w:shd w:val="clear" w:color="auto" w:fill="FFFFFF"/>
+        <w:jc w:val="left"/>
+        <w:rPr>
+          <w:rFonts w:ascii="Arial" w:eastAsia="宋体" w:hAnsi="Arial" w:cs="Arial"/>
+          <w:color w:val="777777"/>
+          <w:kern w:val="0"/>
+          <w:szCs w:val="21"/>
+        </w:rPr>
+      </w:pPr>
+      <w:r>
+        <w:rPr>
+          <w:rFonts w:ascii="Arial" w:eastAsia="宋体" w:hAnsi="Arial" w:cs="Arial" w:hint="eastAsia"/>
+          <w:color w:val="777777"/>
+          <w:kern w:val="0"/>
+          <w:szCs w:val="21"/>
+        </w:rPr>
+        <w:t>安装相关教程</w:t>
+      </w:r>
+    </w:p>
+    <w:p>
+      <w:pPr>
+        <w:widowControl/>
+        <w:shd w:val="clear" w:color="auto" w:fill="FFFFFF"/>
+        <w:jc w:val="left"/>
+        <w:rPr>
+          <w:rFonts w:ascii="Arial" w:eastAsia="宋体" w:hAnsi="Arial" w:cs="Arial" w:hint="eastAsia"/>
+          <w:color w:val="777777"/>
+          <w:kern w:val="0"/>
+          <w:szCs w:val="21"/>
+        </w:rPr>
+      </w:pPr>
+    </w:p>
     <w:p>
       <w:pPr>
         <w:widowControl/>
@@ -1069,13 +1322,23 @@
         <w:spacing w:after="120"/>
         <w:jc w:val="left"/>
         <w:rPr>
+          <w:rFonts w:ascii="Arial" w:eastAsia="宋体" w:hAnsi="Arial" w:cs="Arial"/>
+          <w:color w:val="333333"/>
+          <w:kern w:val="0"/>
+          <w:szCs w:val="21"/>
+          <w:highlight w:val="yellow"/>
+        </w:rPr>
+      </w:pPr>
+      <w:r>
+        <w:rPr>
           <w:rFonts w:ascii="Arial" w:eastAsia="宋体" w:hAnsi="Arial" w:cs="Arial" w:hint="eastAsia"/>
           <w:color w:val="333333"/>
           <w:kern w:val="0"/>
           <w:szCs w:val="21"/>
           <w:highlight w:val="yellow"/>
         </w:rPr>
-      </w:pPr>
+        <w:t>移除</w:t>
+      </w:r>
       <w:r>
         <w:rPr>
           <w:rFonts w:ascii="Arial" w:eastAsia="宋体" w:hAnsi="Arial" w:cs="Arial" w:hint="eastAsia"/>
@@ -1084,7 +1347,7 @@
           <w:szCs w:val="21"/>
           <w:highlight w:val="yellow"/>
         </w:rPr>
-        <w:t>移除</w:t>
+        <w:t xml:space="preserve"> https://rubygems.org/ </w:t>
       </w:r>
       <w:r>
         <w:rPr>
@@ -1094,8 +1357,9 @@
           <w:szCs w:val="21"/>
           <w:highlight w:val="yellow"/>
         </w:rPr>
-        <w:t xml:space="preserve"> https://rubygems.org/ </w:t>
-      </w:r>
+        <w:t>，并</w:t>
+      </w:r>
+      <w:proofErr w:type="gramStart"/>
       <w:r>
         <w:rPr>
           <w:rFonts w:ascii="Arial" w:eastAsia="宋体" w:hAnsi="Arial" w:cs="Arial" w:hint="eastAsia"/>
@@ -1104,9 +1368,9 @@
           <w:szCs w:val="21"/>
           <w:highlight w:val="yellow"/>
         </w:rPr>
-        <w:t>，并</w:t>
-      </w:r>
-      <w:proofErr w:type="gramStart"/>
+        <w:t>添加淘宝下载</w:t>
+      </w:r>
+      <w:proofErr w:type="gramEnd"/>
       <w:r>
         <w:rPr>
           <w:rFonts w:ascii="Arial" w:eastAsia="宋体" w:hAnsi="Arial" w:cs="Arial" w:hint="eastAsia"/>
@@ -1115,9 +1379,8 @@
           <w:szCs w:val="21"/>
           <w:highlight w:val="yellow"/>
         </w:rPr>
-        <w:t>添加淘宝下载</w:t>
-      </w:r>
-      <w:proofErr w:type="gramEnd"/>
+        <w:t>源</w:t>
+      </w:r>
       <w:r>
         <w:rPr>
           <w:rFonts w:ascii="Arial" w:eastAsia="宋体" w:hAnsi="Arial" w:cs="Arial" w:hint="eastAsia"/>
@@ -1126,17 +1389,32 @@
           <w:szCs w:val="21"/>
           <w:highlight w:val="yellow"/>
         </w:rPr>
-        <w:t>源</w:t>
-      </w:r>
-      <w:r>
-        <w:rPr>
-          <w:rFonts w:ascii="Arial" w:eastAsia="宋体" w:hAnsi="Arial" w:cs="Arial" w:hint="eastAsia"/>
+        <w:t xml:space="preserve"> http://ruby.taobao.org/</w:t>
+      </w:r>
+    </w:p>
+    <w:p>
+      <w:pPr>
+        <w:widowControl/>
+        <w:shd w:val="clear" w:color="auto" w:fill="FFFFFF"/>
+        <w:spacing w:after="120"/>
+        <w:jc w:val="left"/>
+        <w:rPr>
+          <w:rFonts w:ascii="Arial" w:eastAsia="宋体" w:hAnsi="Arial" w:cs="Arial"/>
           <w:color w:val="333333"/>
           <w:kern w:val="0"/>
           <w:szCs w:val="21"/>
           <w:highlight w:val="yellow"/>
         </w:rPr>
-        <w:t xml:space="preserve"> http://ruby.taobao.org/</w:t>
+      </w:pPr>
+      <w:r>
+        <w:rPr>
+          <w:rFonts w:ascii="Arial" w:eastAsia="宋体" w:hAnsi="Arial" w:cs="Arial"/>
+          <w:color w:val="333333"/>
+          <w:kern w:val="0"/>
+          <w:szCs w:val="21"/>
+          <w:highlight w:val="yellow"/>
+        </w:rPr>
+        <w:t>$ gem sources --remove https://rubygems.org/</w:t>
       </w:r>
     </w:p>
     <w:p>
@@ -1161,7 +1439,7 @@
           <w:szCs w:val="21"/>
           <w:highlight w:val="yellow"/>
         </w:rPr>
-        <w:t>$ gem sources --remove https://rubygems.org/</w:t>
+        <w:t>$ gem sources -a https://ruby.taobao.org/</w:t>
       </w:r>
     </w:p>
     <w:p>
@@ -1186,7 +1464,7 @@
           <w:szCs w:val="21"/>
           <w:highlight w:val="yellow"/>
         </w:rPr>
-        <w:t>$ gem sources -a https://ruby.taobao.org/</w:t>
+        <w:t>$ gem sources -l</w:t>
       </w:r>
     </w:p>
     <w:p>
@@ -1211,7 +1489,7 @@
           <w:szCs w:val="21"/>
           <w:highlight w:val="yellow"/>
         </w:rPr>
-        <w:t>$ gem sources -l</w:t>
+        <w:t>*** CURRENT SOURCES ***</w:t>
       </w:r>
     </w:p>
     <w:p>
@@ -1225,18 +1503,17 @@
           <w:color w:val="333333"/>
           <w:kern w:val="0"/>
           <w:szCs w:val="21"/>
+        </w:rPr>
+      </w:pPr>
+      <w:r>
+        <w:rPr>
+          <w:rFonts w:ascii="Arial" w:eastAsia="宋体" w:hAnsi="Arial" w:cs="Arial"/>
+          <w:color w:val="333333"/>
+          <w:kern w:val="0"/>
+          <w:szCs w:val="21"/>
           <w:highlight w:val="yellow"/>
         </w:rPr>
-      </w:pPr>
-      <w:r>
-        <w:rPr>
-          <w:rFonts w:ascii="Arial" w:eastAsia="宋体" w:hAnsi="Arial" w:cs="Arial"/>
-          <w:color w:val="333333"/>
-          <w:kern w:val="0"/>
-          <w:szCs w:val="21"/>
-          <w:highlight w:val="yellow"/>
-        </w:rPr>
-        <w:t>*** CURRENT SOURCES ***</w:t>
+        <w:t>https://ruby.taobao.org</w:t>
       </w:r>
     </w:p>
     <w:p>
@@ -1247,20 +1524,20 @@
         <w:jc w:val="left"/>
         <w:rPr>
           <w:rFonts w:ascii="Arial" w:eastAsia="宋体" w:hAnsi="Arial" w:cs="Arial"/>
-          <w:color w:val="333333"/>
-          <w:kern w:val="0"/>
-          <w:szCs w:val="21"/>
-        </w:rPr>
-      </w:pPr>
-      <w:r>
-        <w:rPr>
-          <w:rFonts w:ascii="Arial" w:eastAsia="宋体" w:hAnsi="Arial" w:cs="Arial"/>
-          <w:color w:val="333333"/>
-          <w:kern w:val="0"/>
-          <w:szCs w:val="21"/>
-          <w:highlight w:val="yellow"/>
-        </w:rPr>
-        <w:t>https://ruby.taobao.org</w:t>
+          <w:color w:val="FF0000"/>
+          <w:kern w:val="0"/>
+          <w:szCs w:val="21"/>
+        </w:rPr>
+      </w:pPr>
+      <w:r>
+        <w:rPr>
+          <w:rFonts w:ascii="Arial" w:eastAsia="宋体" w:hAnsi="Arial" w:cs="Arial"/>
+          <w:color w:val="FF0000"/>
+          <w:kern w:val="0"/>
+          <w:szCs w:val="21"/>
+        </w:rPr>
+        <w:lastRenderedPageBreak/>
+        <w:t>Setup Ruby development environment first.</w:t>
       </w:r>
     </w:p>
     <w:p>
@@ -1283,7 +1560,27 @@
           <w:kern w:val="0"/>
           <w:szCs w:val="21"/>
         </w:rPr>
-        <w:t>Setup Ruby development environment first.</w:t>
+        <w:t xml:space="preserve">$ </w:t>
+      </w:r>
+      <w:proofErr w:type="spellStart"/>
+      <w:r>
+        <w:rPr>
+          <w:rFonts w:ascii="Arial" w:eastAsia="宋体" w:hAnsi="Arial" w:cs="Arial"/>
+          <w:color w:val="FF0000"/>
+          <w:kern w:val="0"/>
+          <w:szCs w:val="21"/>
+        </w:rPr>
+        <w:t>sudo</w:t>
+      </w:r>
+      <w:proofErr w:type="spellEnd"/>
+      <w:r>
+        <w:rPr>
+          <w:rFonts w:ascii="Arial" w:eastAsia="宋体" w:hAnsi="Arial" w:cs="Arial"/>
+          <w:color w:val="FF0000"/>
+          <w:kern w:val="0"/>
+          <w:szCs w:val="21"/>
+        </w:rPr>
+        <w:t xml:space="preserve"> apt install ruby-full build-essential zlib1g-dev</w:t>
       </w:r>
     </w:p>
     <w:p>
@@ -1306,19 +1603,22 @@
           <w:kern w:val="0"/>
           <w:szCs w:val="21"/>
         </w:rPr>
-        <w:t xml:space="preserve">$ </w:t>
-      </w:r>
-      <w:proofErr w:type="spellStart"/>
-      <w:r>
+        <w:t>build-essential: this will install required dependency needed to execute ruby environments.</w:t>
+      </w:r>
+    </w:p>
+    <w:p>
+      <w:pPr>
+        <w:widowControl/>
+        <w:shd w:val="clear" w:color="auto" w:fill="FFFFFF"/>
+        <w:spacing w:after="120"/>
+        <w:jc w:val="left"/>
         <w:rPr>
           <w:rFonts w:ascii="Arial" w:eastAsia="宋体" w:hAnsi="Arial" w:cs="Arial"/>
           <w:color w:val="FF0000"/>
           <w:kern w:val="0"/>
           <w:szCs w:val="21"/>
         </w:rPr>
-        <w:t>sudo</w:t>
-      </w:r>
-      <w:proofErr w:type="spellEnd"/>
+      </w:pPr>
       <w:r>
         <w:rPr>
           <w:rFonts w:ascii="Arial" w:eastAsia="宋体" w:hAnsi="Arial" w:cs="Arial"/>
@@ -1326,7 +1626,7 @@
           <w:kern w:val="0"/>
           <w:szCs w:val="21"/>
         </w:rPr>
-        <w:t xml:space="preserve"> apt install ruby-full build-essential zlib1g-dev</w:t>
+        <w:t>zlib1g-dev: this package includes development files. Mostly they are header files in C and C++ languages.</w:t>
       </w:r>
     </w:p>
     <w:p>
@@ -1337,52 +1637,6 @@
         <w:jc w:val="left"/>
         <w:rPr>
           <w:rFonts w:ascii="Arial" w:eastAsia="宋体" w:hAnsi="Arial" w:cs="Arial"/>
-          <w:color w:val="FF0000"/>
-          <w:kern w:val="0"/>
-          <w:szCs w:val="21"/>
-        </w:rPr>
-      </w:pPr>
-      <w:r>
-        <w:rPr>
-          <w:rFonts w:ascii="Arial" w:eastAsia="宋体" w:hAnsi="Arial" w:cs="Arial"/>
-          <w:color w:val="FF0000"/>
-          <w:kern w:val="0"/>
-          <w:szCs w:val="21"/>
-        </w:rPr>
-        <w:t>build-essential: this will install required dependency needed to execute ruby environments.</w:t>
-      </w:r>
-    </w:p>
-    <w:p>
-      <w:pPr>
-        <w:widowControl/>
-        <w:shd w:val="clear" w:color="auto" w:fill="FFFFFF"/>
-        <w:spacing w:after="120"/>
-        <w:jc w:val="left"/>
-        <w:rPr>
-          <w:rFonts w:ascii="Arial" w:eastAsia="宋体" w:hAnsi="Arial" w:cs="Arial"/>
-          <w:color w:val="FF0000"/>
-          <w:kern w:val="0"/>
-          <w:szCs w:val="21"/>
-        </w:rPr>
-      </w:pPr>
-      <w:r>
-        <w:rPr>
-          <w:rFonts w:ascii="Arial" w:eastAsia="宋体" w:hAnsi="Arial" w:cs="Arial"/>
-          <w:color w:val="FF0000"/>
-          <w:kern w:val="0"/>
-          <w:szCs w:val="21"/>
-        </w:rPr>
-        <w:t>zlib1g-dev: this package includes development files. Mostly they are header files in C and C++ languages.</w:t>
-      </w:r>
-    </w:p>
-    <w:p>
-      <w:pPr>
-        <w:widowControl/>
-        <w:shd w:val="clear" w:color="auto" w:fill="FFFFFF"/>
-        <w:spacing w:after="120"/>
-        <w:jc w:val="left"/>
-        <w:rPr>
-          <w:rFonts w:ascii="Arial" w:eastAsia="宋体" w:hAnsi="Arial" w:cs="Arial" w:hint="eastAsia"/>
           <w:color w:val="333333"/>
           <w:kern w:val="0"/>
           <w:szCs w:val="21"/>
@@ -1416,7 +1670,6 @@
           <w:sz w:val="24"/>
           <w:szCs w:val="24"/>
         </w:rPr>
-        <w:lastRenderedPageBreak/>
         <w:t xml:space="preserve">3 </w:t>
       </w:r>
       <w:r>
@@ -1961,7 +2214,7 @@
           <w:color w:val="FF0000"/>
         </w:rPr>
       </w:pPr>
-      <w:hyperlink r:id="rId6" w:history="1">
+      <w:hyperlink r:id="rId7" w:history="1">
         <w:r>
           <w:rPr>
             <w:rStyle w:val="a4"/>
@@ -2006,7 +2259,7 @@
                     </pic:cNvPicPr>
                   </pic:nvPicPr>
                   <pic:blipFill>
-                    <a:blip r:embed="rId7">
+                    <a:blip r:embed="rId8">
                       <a:extLst>
                         <a:ext uri="{28A0092B-C50C-407E-A947-70E740481C1C}">
                           <a14:useLocalDpi xmlns:a14="http://schemas.microsoft.com/office/drawing/2010/main" val="0"/>
@@ -2139,6 +2392,7 @@
           <w:sz w:val="18"/>
           <w:szCs w:val="18"/>
         </w:rPr>
+        <w:lastRenderedPageBreak/>
         <w:t xml:space="preserve">gem install </w:t>
       </w:r>
       <w:proofErr w:type="spellStart"/>
@@ -2236,7 +2490,6 @@
                 <w:bCs/>
                 <w:color w:val="323232"/>
               </w:rPr>
-              <w:lastRenderedPageBreak/>
               <w:t>Step 1.</w:t>
             </w:r>
             <w:r>
@@ -2326,7 +2579,7 @@
                           </pic:cNvPicPr>
                         </pic:nvPicPr>
                         <pic:blipFill>
-                          <a:blip r:embed="rId8">
+                          <a:blip r:embed="rId9">
                             <a:extLst>
                               <a:ext uri="{28A0092B-C50C-407E-A947-70E740481C1C}">
                                 <a14:useLocalDpi xmlns:a14="http://schemas.microsoft.com/office/drawing/2010/main" val="0"/>
@@ -2602,7 +2855,7 @@
                           </pic:cNvPicPr>
                         </pic:nvPicPr>
                         <pic:blipFill>
-                          <a:blip r:embed="rId9">
+                          <a:blip r:embed="rId10">
                             <a:extLst>
                               <a:ext uri="{28A0092B-C50C-407E-A947-70E740481C1C}">
                                 <a14:useLocalDpi xmlns:a14="http://schemas.microsoft.com/office/drawing/2010/main" val="0"/>
@@ -2671,6 +2924,7 @@
                 <w:bCs/>
                 <w:color w:val="323232"/>
               </w:rPr>
+              <w:lastRenderedPageBreak/>
               <w:t>Step 4.</w:t>
             </w:r>
             <w:r>
@@ -2746,7 +3000,6 @@
                 <w:noProof/>
                 <w:color w:val="323232"/>
               </w:rPr>
-              <w:lastRenderedPageBreak/>
               <w:drawing>
                 <wp:inline distT="0" distB="0" distL="0" distR="0" wp14:anchorId="6E8E20C9" wp14:editId="1F672E76">
                   <wp:extent cx="2962275" cy="476885"/>
@@ -2765,7 +3018,7 @@
                           </pic:cNvPicPr>
                         </pic:nvPicPr>
                         <pic:blipFill>
-                          <a:blip r:embed="rId10">
+                          <a:blip r:embed="rId11">
                             <a:extLst>
                               <a:ext uri="{28A0092B-C50C-407E-A947-70E740481C1C}">
                                 <a14:useLocalDpi xmlns:a14="http://schemas.microsoft.com/office/drawing/2010/main" val="0"/>
@@ -2914,7 +3167,7 @@
                           </pic:cNvPicPr>
                         </pic:nvPicPr>
                         <pic:blipFill>
-                          <a:blip r:embed="rId11">
+                          <a:blip r:embed="rId12">
                             <a:extLst>
                               <a:ext uri="{28A0092B-C50C-407E-A947-70E740481C1C}">
                                 <a14:useLocalDpi xmlns:a14="http://schemas.microsoft.com/office/drawing/2010/main" val="0"/>
@@ -2994,7 +3247,7 @@
               </w:rPr>
               <w:t> </w:t>
             </w:r>
-            <w:hyperlink r:id="rId12" w:history="1">
+            <w:hyperlink r:id="rId13" w:history="1">
               <w:r>
                 <w:rPr>
                   <w:rStyle w:val="a4"/>
@@ -3041,7 +3294,7 @@
                           </pic:cNvPicPr>
                         </pic:nvPicPr>
                         <pic:blipFill>
-                          <a:blip r:embed="rId13">
+                          <a:blip r:embed="rId14">
                             <a:extLst>
                               <a:ext uri="{28A0092B-C50C-407E-A947-70E740481C1C}">
                                 <a14:useLocalDpi xmlns:a14="http://schemas.microsoft.com/office/drawing/2010/main" val="0"/>
@@ -3126,7 +3379,7 @@
                           </pic:cNvPicPr>
                         </pic:nvPicPr>
                         <pic:blipFill>
-                          <a:blip r:embed="rId14">
+                          <a:blip r:embed="rId15">
                             <a:extLst>
                               <a:ext uri="{28A0092B-C50C-407E-A947-70E740481C1C}">
                                 <a14:useLocalDpi xmlns:a14="http://schemas.microsoft.com/office/drawing/2010/main" val="0"/>
@@ -3243,7 +3496,6 @@
           <w:p>
             <w:pPr>
               <w:rPr>
-                <w:rFonts w:hint="eastAsia"/>
                 <w:color w:val="FF0000"/>
               </w:rPr>
             </w:pPr>
@@ -3254,7 +3506,6 @@
     <w:p>
       <w:pPr>
         <w:rPr>
-          <w:rFonts w:hint="eastAsia"/>
           <w:color w:val="FF0000"/>
         </w:rPr>
       </w:pPr>

</xml_diff>